<commit_message>
Probe 0.9.0: full demo KA (3 boxes, 40+ changes), link field in the box, title, table rows, sub-bullets, new sections
- Update from Doc: the Doc link goes in a field inside the results box, so it
  survives switching tabs; on NO MATCH the field comes back to retry
- All 5 content boxes in Content Index order; the Doc's page header, title,
  [Image]/[Embedded content] stand-ins and (Return to contents) are handled
- Title change from the Doc; new/removed table rows; bullets at their level;
  new sections with their lists; new Contents entries linked to new headings
- Demo: 'Pro account guide' compiling every pro topic, Doc shaped like a real
  Content Index Doc

Co-Authored-By: Claude Opus 5.5 <noreply@anthropic.com>
Claude-Session: https://claude.ai/code/session_01JtGHoRQvm6kbWodLT7GC6x
</commit_message>
<xml_diff>
--- a/tools/demo/KA demo - changes.docx
+++ b/tools/demo/KA demo - changes.docx
@@ -2,13 +2,40 @@
 <file path=word/document.xml><?xml version="1.0" encoding="utf-8"?>
 <w:document xmlns:wpc="http://schemas.microsoft.com/office/word/2010/wordprocessingCanvas" xmlns:mo="http://schemas.microsoft.com/office/mac/office/2008/main" xmlns:mc="http://schemas.openxmlformats.org/markup-compatibility/2006" xmlns:mv="urn:schemas-microsoft-com:mac:vml" xmlns:o="urn:schemas-microsoft-com:office:office" xmlns:r="http://schemas.openxmlformats.org/officeDocument/2006/relationships" xmlns:m="http://schemas.openxmlformats.org/officeDocument/2006/math" xmlns:v="urn:schemas-microsoft-com:vml" xmlns:wp14="http://schemas.microsoft.com/office/word/2010/wordprocessingDrawing" xmlns:wp="http://schemas.openxmlformats.org/drawingml/2006/wordprocessingDrawing" xmlns:w10="urn:schemas-microsoft-com:office:word" xmlns:w="http://schemas.openxmlformats.org/wordprocessingml/2006/main" xmlns:w14="http://schemas.microsoft.com/office/word/2010/wordml" xmlns:wpg="http://schemas.microsoft.com/office/word/2010/wordprocessingGroup" xmlns:wpi="http://schemas.microsoft.com/office/word/2010/wordprocessingInk" xmlns:wne="http://schemas.microsoft.com/office/word/2006/wordml" xmlns:wps="http://schemas.microsoft.com/office/word/2010/wordprocessingShape" mc:Ignorable="w14 wp14">
   <w:body>
+    <w:p>
+      <w:pPr>
+        <w:pStyle w:val="Heading1"/>
+      </w:pPr>
+      <w:r>
+        <w:rPr>
+          <w:b w:val="0"/>
+          <w:i w:val="0"/>
+        </w:rPr>
+        <w:t xml:space="preserve">Demo: Pro account </w:t>
+      </w:r>
+      <w:r>
+        <w:rPr>
+          <w:b w:val="0"/>
+          <w:i w:val="0"/>
+          <w:color w:val="009933"/>
+        </w:rPr>
+        <w:t xml:space="preserve">complete </w:t>
+      </w:r>
+      <w:r>
+        <w:rPr>
+          <w:b w:val="0"/>
+          <w:i w:val="0"/>
+        </w:rPr>
+        <w:t>guide (Pro)</w:t>
+      </w:r>
+    </w:p>
     <w:p>
       <w:r>
         <w:rPr>
           <w:b w:val="0"/>
           <w:i/>
         </w:rPr>
-        <w:t>Demo article for the "Update from Doc" test. Not real guidance.</w:t>
+        <w:t>Demo article for the "Update from Doc" test. It mixes a little of every pro topic. Not real guidance.</w:t>
       </w:r>
     </w:p>
     <w:p>
@@ -16,12 +43,16 @@
         <w:rPr>
           <w:b/>
         </w:rPr>
-        <w:t>▶ Contents</w:t>
+        <w:t>Contents</w:t>
       </w:r>
     </w:p>
     <w:p>
       <w:pPr>
-        <w:pStyle w:val="ListNumber"/>
+        <w:pStyle w:val="ListParagraph"/>
+        <w:numPr>
+          <w:ilvl w:val="0"/>
+          <w:numId w:val="10"/>
+        </w:numPr>
       </w:pPr>
       <w:r>
         <w:rPr>
@@ -33,31 +64,139 @@
     </w:p>
     <w:p>
       <w:pPr>
-        <w:pStyle w:val="ListNumber"/>
+        <w:pStyle w:val="ListParagraph"/>
+        <w:numPr>
+          <w:ilvl w:val="0"/>
+          <w:numId w:val="10"/>
+        </w:numPr>
       </w:pPr>
       <w:r>
         <w:rPr>
           <w:b w:val="0"/>
           <w:i w:val="0"/>
         </w:rPr>
-        <w:t>How it works</w:t>
+        <w:t>Getting started</w:t>
       </w:r>
     </w:p>
     <w:p>
       <w:pPr>
-        <w:pStyle w:val="ListNumber"/>
+        <w:pStyle w:val="ListParagraph"/>
+        <w:numPr>
+          <w:ilvl w:val="0"/>
+          <w:numId w:val="10"/>
+        </w:numPr>
       </w:pPr>
       <w:r>
         <w:rPr>
           <w:b w:val="0"/>
           <w:i w:val="0"/>
         </w:rPr>
-        <w:t>Lead prices</w:t>
+        <w:t>Profile and reviews</w:t>
       </w:r>
     </w:p>
     <w:p>
       <w:pPr>
-        <w:pStyle w:val="ListNumber"/>
+        <w:pStyle w:val="ListParagraph"/>
+        <w:numPr>
+          <w:ilvl w:val="0"/>
+          <w:numId w:val="10"/>
+        </w:numPr>
+      </w:pPr>
+      <w:r>
+        <w:rPr>
+          <w:b w:val="0"/>
+          <w:i w:val="0"/>
+        </w:rPr>
+        <w:t>Leads and targeting</w:t>
+      </w:r>
+    </w:p>
+    <w:p>
+      <w:pPr>
+        <w:pStyle w:val="ListParagraph"/>
+        <w:numPr>
+          <w:ilvl w:val="0"/>
+          <w:numId w:val="10"/>
+        </w:numPr>
+      </w:pPr>
+      <w:r>
+        <w:rPr>
+          <w:b w:val="0"/>
+          <w:i w:val="0"/>
+        </w:rPr>
+        <w:t>Pricing and budget</w:t>
+      </w:r>
+    </w:p>
+    <w:p>
+      <w:pPr>
+        <w:pStyle w:val="ListParagraph"/>
+        <w:numPr>
+          <w:ilvl w:val="0"/>
+          <w:numId w:val="10"/>
+        </w:numPr>
+      </w:pPr>
+      <w:r>
+        <w:rPr>
+          <w:b w:val="0"/>
+          <w:i w:val="0"/>
+        </w:rPr>
+        <w:t>Messages and quotes</w:t>
+      </w:r>
+    </w:p>
+    <w:p>
+      <w:pPr>
+        <w:pStyle w:val="ListParagraph"/>
+        <w:numPr>
+          <w:ilvl w:val="0"/>
+          <w:numId w:val="10"/>
+        </w:numPr>
+      </w:pPr>
+      <w:r>
+        <w:rPr>
+          <w:b w:val="0"/>
+          <w:i w:val="0"/>
+        </w:rPr>
+        <w:t>Payments and refunds</w:t>
+      </w:r>
+    </w:p>
+    <w:p>
+      <w:pPr>
+        <w:pStyle w:val="ListParagraph"/>
+        <w:numPr>
+          <w:ilvl w:val="0"/>
+          <w:numId w:val="10"/>
+        </w:numPr>
+      </w:pPr>
+      <w:r>
+        <w:rPr>
+          <w:b w:val="0"/>
+          <w:i w:val="0"/>
+        </w:rPr>
+        <w:t>Top Pro and badges</w:t>
+      </w:r>
+    </w:p>
+    <w:p>
+      <w:pPr>
+        <w:pStyle w:val="ListParagraph"/>
+        <w:numPr>
+          <w:ilvl w:val="0"/>
+          <w:numId w:val="10"/>
+        </w:numPr>
+      </w:pPr>
+      <w:r>
+        <w:rPr>
+          <w:b w:val="0"/>
+          <w:i w:val="0"/>
+        </w:rPr>
+        <w:t>Account safety</w:t>
+      </w:r>
+    </w:p>
+    <w:p>
+      <w:pPr>
+        <w:pStyle w:val="ListParagraph"/>
+        <w:numPr>
+          <w:ilvl w:val="0"/>
+          <w:numId w:val="10"/>
+        </w:numPr>
       </w:pPr>
       <w:r>
         <w:rPr>
@@ -69,7 +208,11 @@
     </w:p>
     <w:p>
       <w:pPr>
-        <w:pStyle w:val="ListNumber"/>
+        <w:pStyle w:val="ListParagraph"/>
+        <w:numPr>
+          <w:ilvl w:val="0"/>
+          <w:numId w:val="10"/>
+        </w:numPr>
       </w:pPr>
       <w:r>
         <w:rPr>
@@ -81,7 +224,28 @@
     </w:p>
     <w:p>
       <w:pPr>
-        <w:pStyle w:val="ListNumber"/>
+        <w:pStyle w:val="ListParagraph"/>
+        <w:numPr>
+          <w:ilvl w:val="0"/>
+          <w:numId w:val="10"/>
+        </w:numPr>
+      </w:pPr>
+      <w:r>
+        <w:rPr>
+          <w:b w:val="0"/>
+          <w:i w:val="0"/>
+          <w:color w:val="009933"/>
+        </w:rPr>
+        <w:t>Pausing the account</w:t>
+      </w:r>
+    </w:p>
+    <w:p>
+      <w:pPr>
+        <w:pStyle w:val="ListParagraph"/>
+        <w:numPr>
+          <w:ilvl w:val="0"/>
+          <w:numId w:val="10"/>
+        </w:numPr>
       </w:pPr>
       <w:r>
         <w:rPr>
@@ -89,6 +253,22 @@
           <w:i w:val="0"/>
         </w:rPr>
         <w:t>Resources</w:t>
+      </w:r>
+    </w:p>
+    <w:p>
+      <w:r>
+        <w:rPr>
+          <w:b/>
+          <w:i w:val="0"/>
+        </w:rPr>
+        <w:t>Important:</w:t>
+      </w:r>
+      <w:r>
+        <w:rPr>
+          <w:b w:val="0"/>
+          <w:i w:val="0"/>
+        </w:rPr>
+        <w:t xml:space="preserve"> always check the pro's account in the admin tool before you answer.</w:t>
       </w:r>
     </w:p>
     <w:p>
@@ -117,7 +297,11 @@
     </w:p>
     <w:p>
       <w:pPr>
-        <w:pStyle w:val="ListBullet"/>
+        <w:pStyle w:val="ListParagraph"/>
+        <w:numPr>
+          <w:ilvl w:val="0"/>
+          <w:numId w:val="11"/>
+        </w:numPr>
       </w:pPr>
       <w:r>
         <w:rPr>
@@ -125,19 +309,39 @@
           <w:i w:val="0"/>
           <w:color w:val="009933"/>
         </w:rPr>
-        <w:t>Oct 8, 2026: Leads now show the customer's preferred contact time.</w:t>
+        <w:t>Oct 8, 2026: Added the section about pausing the account.</w:t>
       </w:r>
     </w:p>
     <w:p>
       <w:pPr>
-        <w:pStyle w:val="ListBullet"/>
+        <w:pStyle w:val="ListParagraph"/>
+        <w:numPr>
+          <w:ilvl w:val="0"/>
+          <w:numId w:val="11"/>
+        </w:numPr>
       </w:pPr>
       <w:r>
         <w:rPr>
           <w:b w:val="0"/>
           <w:i w:val="0"/>
         </w:rPr>
-        <w:t>Sep 30, 2026: Added the steps for the Messages tab.</w:t>
+        <w:t>Sep 30, 2026: Updated the lead prices.</w:t>
+      </w:r>
+    </w:p>
+    <w:p>
+      <w:pPr>
+        <w:pStyle w:val="ListParagraph"/>
+        <w:numPr>
+          <w:ilvl w:val="0"/>
+          <w:numId w:val="11"/>
+        </w:numPr>
+      </w:pPr>
+      <w:r>
+        <w:rPr>
+          <w:b w:val="0"/>
+          <w:i w:val="0"/>
+        </w:rPr>
+        <w:t>Aug 12, 2026: Added the steps for the Messages tab.</w:t>
       </w:r>
     </w:p>
     <w:p>
@@ -149,31 +353,400 @@
           <w:b w:val="0"/>
           <w:i w:val="0"/>
         </w:rPr>
-        <w:t>b. Key points</w:t>
+        <w:t>b. Who this is for</w:t>
+      </w:r>
+    </w:p>
+    <w:p>
+      <w:r>
+        <w:rPr>
+          <w:b w:val="0"/>
+          <w:i w:val="0"/>
+        </w:rPr>
+        <w:t>Reps who help pros with their account, leads, billing and safety.</w:t>
+      </w:r>
+      <w:r>
+        <w:rPr>
+          <w:b w:val="0"/>
+          <w:i w:val="0"/>
+          <w:color w:val="009933"/>
+        </w:rPr>
+        <w:t xml:space="preserve"> It is also a good start for new hires.</w:t>
       </w:r>
     </w:p>
     <w:p>
       <w:pPr>
-        <w:pStyle w:val="ListBullet"/>
+        <w:pStyle w:val="Heading3"/>
       </w:pPr>
       <w:r>
         <w:rPr>
           <w:b w:val="0"/>
           <w:i w:val="0"/>
         </w:rPr>
-        <w:t>Pros get leads that match their services and travel area.</w:t>
+        <w:t>c. Key terms</w:t>
       </w:r>
     </w:p>
+    <w:tbl>
+      <w:tblPr>
+        <w:tblStyle w:val="TableGrid"/>
+        <w:tblW w:type="auto" w:w="0"/>
+        <w:tblLook w:firstColumn="1" w:firstRow="1" w:lastColumn="0" w:lastRow="0" w:noHBand="0" w:noVBand="1" w:val="04A0"/>
+      </w:tblPr>
+      <w:tblGrid>
+        <w:gridCol w:w="4320"/>
+        <w:gridCol w:w="4320"/>
+      </w:tblGrid>
+      <w:tr>
+        <w:tc>
+          <w:tcPr>
+            <w:tcW w:type="dxa" w:w="4320"/>
+          </w:tcPr>
+          <w:p>
+            <w:r>
+              <w:rPr>
+                <w:b/>
+                <w:i w:val="0"/>
+              </w:rPr>
+              <w:t>Term</w:t>
+            </w:r>
+          </w:p>
+        </w:tc>
+        <w:tc>
+          <w:tcPr>
+            <w:tcW w:type="dxa" w:w="4320"/>
+          </w:tcPr>
+          <w:p>
+            <w:r>
+              <w:rPr>
+                <w:b/>
+                <w:i w:val="0"/>
+              </w:rPr>
+              <w:t>What it means</w:t>
+            </w:r>
+          </w:p>
+        </w:tc>
+      </w:tr>
+      <w:tr>
+        <w:tc>
+          <w:tcPr>
+            <w:tcW w:type="dxa" w:w="4320"/>
+          </w:tcPr>
+          <w:p>
+            <w:r>
+              <w:rPr>
+                <w:b w:val="0"/>
+                <w:i w:val="0"/>
+              </w:rPr>
+              <w:t>Lead</w:t>
+            </w:r>
+          </w:p>
+        </w:tc>
+        <w:tc>
+          <w:tcPr>
+            <w:tcW w:type="dxa" w:w="4320"/>
+          </w:tcPr>
+          <w:p>
+            <w:r>
+              <w:rPr>
+                <w:b w:val="0"/>
+                <w:i w:val="0"/>
+              </w:rPr>
+              <w:t>A customer request sent to a pro.</w:t>
+            </w:r>
+          </w:p>
+        </w:tc>
+      </w:tr>
+      <w:tr>
+        <w:tc>
+          <w:tcPr>
+            <w:tcW w:type="dxa" w:w="4320"/>
+          </w:tcPr>
+          <w:p>
+            <w:r>
+              <w:rPr>
+                <w:b w:val="0"/>
+                <w:i w:val="0"/>
+              </w:rPr>
+              <w:t>Direct lead</w:t>
+            </w:r>
+          </w:p>
+        </w:tc>
+        <w:tc>
+          <w:tcPr>
+            <w:tcW w:type="dxa" w:w="4320"/>
+          </w:tcPr>
+          <w:p>
+            <w:r>
+              <w:rPr>
+                <w:b w:val="0"/>
+                <w:i w:val="0"/>
+              </w:rPr>
+              <w:t xml:space="preserve">The customer chose this pro </w:t>
+            </w:r>
+            <w:r>
+              <w:rPr>
+                <w:b w:val="0"/>
+                <w:i w:val="0"/>
+                <w:strike/>
+                <w:color w:val="FF0000"/>
+              </w:rPr>
+              <w:t>by name</w:t>
+            </w:r>
+            <w:r>
+              <w:rPr>
+                <w:b w:val="0"/>
+                <w:i w:val="0"/>
+                <w:color w:val="009933"/>
+              </w:rPr>
+              <w:t>from the search results</w:t>
+            </w:r>
+            <w:r>
+              <w:rPr>
+                <w:b w:val="0"/>
+                <w:i w:val="0"/>
+              </w:rPr>
+              <w:t>.</w:t>
+            </w:r>
+          </w:p>
+        </w:tc>
+      </w:tr>
+      <w:tr>
+        <w:tc>
+          <w:tcPr>
+            <w:tcW w:type="dxa" w:w="4320"/>
+          </w:tcPr>
+          <w:p>
+            <w:r>
+              <w:rPr>
+                <w:b w:val="0"/>
+                <w:i w:val="0"/>
+              </w:rPr>
+              <w:t>Opportunity</w:t>
+            </w:r>
+          </w:p>
+        </w:tc>
+        <w:tc>
+          <w:tcPr>
+            <w:tcW w:type="dxa" w:w="4320"/>
+          </w:tcPr>
+          <w:p>
+            <w:r>
+              <w:rPr>
+                <w:b w:val="0"/>
+                <w:i w:val="0"/>
+              </w:rPr>
+              <w:t>A lead the pro can choose to pay for.</w:t>
+            </w:r>
+          </w:p>
+        </w:tc>
+      </w:tr>
+      <w:tr>
+        <w:tc>
+          <w:tcPr>
+            <w:tcW w:type="dxa" w:w="4320"/>
+          </w:tcPr>
+          <w:p>
+            <w:r>
+              <w:rPr>
+                <w:b w:val="0"/>
+                <w:i w:val="0"/>
+                <w:color w:val="009933"/>
+              </w:rPr>
+              <w:t>Instant match</w:t>
+            </w:r>
+          </w:p>
+        </w:tc>
+        <w:tc>
+          <w:tcPr>
+            <w:tcW w:type="dxa" w:w="4320"/>
+          </w:tcPr>
+          <w:p>
+            <w:r>
+              <w:rPr>
+                <w:b w:val="0"/>
+                <w:i w:val="0"/>
+                <w:color w:val="009933"/>
+              </w:rPr>
+              <w:t>The pro is matched right away, based on their preferences.</w:t>
+            </w:r>
+          </w:p>
+        </w:tc>
+      </w:tr>
+      <w:tr>
+        <w:tc>
+          <w:tcPr>
+            <w:tcW w:type="dxa" w:w="4320"/>
+          </w:tcPr>
+          <w:p>
+            <w:r>
+              <w:rPr>
+                <w:b w:val="0"/>
+                <w:i w:val="0"/>
+                <w:strike/>
+                <w:color w:val="FF0000"/>
+              </w:rPr>
+              <w:t>Spotlight</w:t>
+            </w:r>
+          </w:p>
+        </w:tc>
+        <w:tc>
+          <w:tcPr>
+            <w:tcW w:type="dxa" w:w="4320"/>
+          </w:tcPr>
+          <w:p>
+            <w:r>
+              <w:rPr>
+                <w:b w:val="0"/>
+                <w:i w:val="0"/>
+                <w:strike/>
+                <w:color w:val="FF0000"/>
+              </w:rPr>
+              <w:t>Old name for featured placement.</w:t>
+            </w:r>
+          </w:p>
+        </w:tc>
+      </w:tr>
+    </w:tbl>
     <w:p>
       <w:pPr>
-        <w:pStyle w:val="ListBullet"/>
+        <w:pStyle w:val="Heading2"/>
       </w:pPr>
       <w:r>
         <w:rPr>
           <w:b w:val="0"/>
           <w:i w:val="0"/>
         </w:rPr>
-        <w:t xml:space="preserve">Reply to new leads within </w:t>
+        <w:t>2. Getting started</w:t>
+      </w:r>
+    </w:p>
+    <w:p>
+      <w:pPr>
+        <w:pStyle w:val="ListParagraph"/>
+        <w:numPr>
+          <w:ilvl w:val="0"/>
+          <w:numId w:val="12"/>
+        </w:numPr>
+      </w:pPr>
+      <w:r>
+        <w:rPr>
+          <w:b w:val="0"/>
+          <w:i w:val="0"/>
+        </w:rPr>
+        <w:t>Create the account with an email or phone number.</w:t>
+      </w:r>
+    </w:p>
+    <w:p>
+      <w:pPr>
+        <w:pStyle w:val="ListParagraph"/>
+        <w:numPr>
+          <w:ilvl w:val="0"/>
+          <w:numId w:val="12"/>
+        </w:numPr>
+      </w:pPr>
+      <w:r>
+        <w:rPr>
+          <w:b w:val="0"/>
+          <w:i w:val="0"/>
+        </w:rPr>
+        <w:t>Add the services they offer.</w:t>
+      </w:r>
+    </w:p>
+    <w:p>
+      <w:pPr>
+        <w:pStyle w:val="ListParagraph"/>
+        <w:numPr>
+          <w:ilvl w:val="1"/>
+          <w:numId w:val="12"/>
+        </w:numPr>
+      </w:pPr>
+      <w:r>
+        <w:rPr>
+          <w:b w:val="0"/>
+          <w:i w:val="0"/>
+        </w:rPr>
+        <w:t>Pick the main category first.</w:t>
+      </w:r>
+    </w:p>
+    <w:p>
+      <w:pPr>
+        <w:pStyle w:val="ListParagraph"/>
+        <w:numPr>
+          <w:ilvl w:val="1"/>
+          <w:numId w:val="12"/>
+        </w:numPr>
+      </w:pPr>
+      <w:r>
+        <w:rPr>
+          <w:b w:val="0"/>
+          <w:i w:val="0"/>
+          <w:color w:val="009933"/>
+        </w:rPr>
+        <w:t>Add up to 10 related services.</w:t>
+      </w:r>
+    </w:p>
+    <w:p>
+      <w:pPr>
+        <w:pStyle w:val="ListParagraph"/>
+        <w:numPr>
+          <w:ilvl w:val="0"/>
+          <w:numId w:val="12"/>
+        </w:numPr>
+      </w:pPr>
+      <w:r>
+        <w:rPr>
+          <w:b w:val="0"/>
+          <w:i w:val="0"/>
+        </w:rPr>
+        <w:t>Set the travel area.</w:t>
+      </w:r>
+    </w:p>
+    <w:p>
+      <w:pPr>
+        <w:pStyle w:val="ListParagraph"/>
+        <w:numPr>
+          <w:ilvl w:val="0"/>
+          <w:numId w:val="12"/>
+        </w:numPr>
+      </w:pPr>
+      <w:r>
+        <w:rPr>
+          <w:b w:val="0"/>
+          <w:i w:val="0"/>
+        </w:rPr>
+        <w:t>Add a payment method.</w:t>
+      </w:r>
+    </w:p>
+    <w:p>
+      <w:pPr>
+        <w:pStyle w:val="ListParagraph"/>
+        <w:numPr>
+          <w:ilvl w:val="0"/>
+          <w:numId w:val="12"/>
+        </w:numPr>
+      </w:pPr>
+      <w:r>
+        <w:rPr>
+          <w:b w:val="0"/>
+          <w:i w:val="0"/>
+          <w:color w:val="009933"/>
+        </w:rPr>
+        <w:t>Turn on notifications so no lead is missed.</w:t>
+      </w:r>
+    </w:p>
+    <w:p>
+      <w:r>
+        <w:rPr>
+          <w:i/>
+        </w:rPr>
+        <w:t>[Image: demo-profile-old.png]</w:t>
+      </w:r>
+    </w:p>
+    <w:p>
+      <w:r>
+        <w:rPr>
+          <w:b w:val="0"/>
+          <w:i w:val="0"/>
+        </w:rPr>
+        <w:t xml:space="preserve">Most pros finish setup in about </w:t>
       </w:r>
       <w:r>
         <w:rPr>
@@ -182,7 +755,7 @@
           <w:strike/>
           <w:color w:val="FF0000"/>
         </w:rPr>
-        <w:t>24</w:t>
+        <w:t>15</w:t>
       </w:r>
       <w:r>
         <w:rPr>
@@ -190,40 +763,14 @@
           <w:i w:val="0"/>
           <w:color w:val="009933"/>
         </w:rPr>
-        <w:t>12</w:t>
+        <w:t>10</w:t>
       </w:r>
       <w:r>
         <w:rPr>
           <w:b w:val="0"/>
           <w:i w:val="0"/>
         </w:rPr>
-        <w:t xml:space="preserve"> hours to keep a strong response rate.</w:t>
-      </w:r>
-    </w:p>
-    <w:p>
-      <w:pPr>
-        <w:pStyle w:val="ListBullet"/>
-      </w:pPr>
-      <w:r>
-        <w:rPr>
-          <w:b w:val="0"/>
-          <w:i w:val="0"/>
-          <w:strike/>
-          <w:color w:val="FF0000"/>
-        </w:rPr>
-        <w:t>Leads older than 30 days are archived automatically.</w:t>
-      </w:r>
-    </w:p>
-    <w:p>
-      <w:pPr>
-        <w:pStyle w:val="ListBullet"/>
-      </w:pPr>
-      <w:r>
-        <w:rPr>
-          <w:b w:val="0"/>
-          <w:i w:val="0"/>
-        </w:rPr>
-        <w:t>Customers can message more than one pro.</w:t>
+        <w:t xml:space="preserve"> minutes.</w:t>
       </w:r>
     </w:p>
     <w:p>
@@ -235,50 +782,140 @@
           <w:b w:val="0"/>
           <w:i w:val="0"/>
         </w:rPr>
-        <w:t>2. How it works</w:t>
+        <w:t>3. Profile and reviews</w:t>
+      </w:r>
+    </w:p>
+    <w:p>
+      <w:r>
+        <w:rPr>
+          <w:b w:val="0"/>
+          <w:i w:val="0"/>
+        </w:rPr>
+        <w:t>A complete profile gets more leads. Pros should add:</w:t>
       </w:r>
     </w:p>
     <w:p>
       <w:pPr>
-        <w:pStyle w:val="ListNumber"/>
+        <w:pStyle w:val="ListParagraph"/>
+        <w:numPr>
+          <w:ilvl w:val="0"/>
+          <w:numId w:val="13"/>
+        </w:numPr>
       </w:pPr>
       <w:r>
         <w:rPr>
           <w:b w:val="0"/>
           <w:i w:val="0"/>
         </w:rPr>
-        <w:t xml:space="preserve">The pro opens the </w:t>
-      </w:r>
-      <w:r>
-        <w:rPr>
-          <w:b/>
-          <w:i w:val="0"/>
-        </w:rPr>
-        <w:t>Jobs</w:t>
-      </w:r>
-      <w:r>
-        <w:rPr>
-          <w:b w:val="0"/>
-          <w:i w:val="0"/>
-        </w:rPr>
-        <w:t xml:space="preserve"> tab in the app.</w:t>
+        <w:t>A clear profile photo or logo.</w:t>
       </w:r>
     </w:p>
     <w:p>
       <w:pPr>
-        <w:pStyle w:val="ListNumber"/>
+        <w:pStyle w:val="ListParagraph"/>
+        <w:numPr>
+          <w:ilvl w:val="0"/>
+          <w:numId w:val="13"/>
+        </w:numPr>
       </w:pPr>
       <w:r>
         <w:rPr>
           <w:b w:val="0"/>
           <w:i w:val="0"/>
         </w:rPr>
-        <w:t>They tap a lead to see the project details.</w:t>
+        <w:t>An introduction with their experience.</w:t>
       </w:r>
     </w:p>
     <w:p>
       <w:pPr>
-        <w:pStyle w:val="ListNumber"/>
+        <w:pStyle w:val="ListParagraph"/>
+        <w:numPr>
+          <w:ilvl w:val="0"/>
+          <w:numId w:val="13"/>
+        </w:numPr>
+      </w:pPr>
+      <w:r>
+        <w:rPr>
+          <w:b w:val="0"/>
+          <w:i w:val="0"/>
+        </w:rPr>
+        <w:t>Photos of past work.</w:t>
+      </w:r>
+    </w:p>
+    <w:p>
+      <w:pPr>
+        <w:pStyle w:val="ListParagraph"/>
+        <w:numPr>
+          <w:ilvl w:val="0"/>
+          <w:numId w:val="13"/>
+        </w:numPr>
+      </w:pPr>
+      <w:r>
+        <w:rPr>
+          <w:b w:val="0"/>
+          <w:i w:val="0"/>
+          <w:strike/>
+          <w:color w:val="FF0000"/>
+        </w:rPr>
+        <w:t>A fax number.</w:t>
+      </w:r>
+    </w:p>
+    <w:p>
+      <w:pPr>
+        <w:pStyle w:val="ListParagraph"/>
+        <w:numPr>
+          <w:ilvl w:val="0"/>
+          <w:numId w:val="13"/>
+        </w:numPr>
+      </w:pPr>
+      <w:r>
+        <w:rPr>
+          <w:b w:val="0"/>
+          <w:i w:val="0"/>
+        </w:rPr>
+        <w:t>Business hours.</w:t>
+      </w:r>
+    </w:p>
+    <w:p>
+      <w:r>
+        <w:rPr>
+          <w:b/>
+        </w:rPr>
+        <w:t>▶ How reviews work</w:t>
+      </w:r>
+    </w:p>
+    <w:p>
+      <w:r>
+        <w:rPr>
+          <w:b w:val="0"/>
+          <w:i w:val="0"/>
+        </w:rPr>
+        <w:t>Customers can leave a review after the job. The pro can't edit a review.</w:t>
+      </w:r>
+    </w:p>
+    <w:p>
+      <w:pPr>
+        <w:pStyle w:val="ListParagraph"/>
+        <w:numPr>
+          <w:ilvl w:val="0"/>
+          <w:numId w:val="14"/>
+        </w:numPr>
+      </w:pPr>
+      <w:r>
+        <w:rPr>
+          <w:b w:val="0"/>
+          <w:i w:val="0"/>
+        </w:rPr>
+        <w:t>Pros can reply to each review once.</w:t>
+      </w:r>
+    </w:p>
+    <w:p>
+      <w:pPr>
+        <w:pStyle w:val="ListParagraph"/>
+        <w:numPr>
+          <w:ilvl w:val="0"/>
+          <w:numId w:val="14"/>
+        </w:numPr>
       </w:pPr>
       <w:r>
         <w:rPr>
@@ -286,99 +923,7 @@
           <w:i w:val="0"/>
           <w:color w:val="009933"/>
         </w:rPr>
-        <w:t>They check the customer's preferred contact time.</w:t>
-      </w:r>
-    </w:p>
-    <w:p>
-      <w:pPr>
-        <w:pStyle w:val="ListNumber"/>
-      </w:pPr>
-      <w:r>
-        <w:rPr>
-          <w:b w:val="0"/>
-          <w:i w:val="0"/>
-        </w:rPr>
-        <w:t>They send a quote or a message.</w:t>
-      </w:r>
-    </w:p>
-    <w:p>
-      <w:r>
-        <w:drawing>
-          <wp:inline xmlns:a="http://schemas.openxmlformats.org/drawingml/2006/main" xmlns:pic="http://schemas.openxmlformats.org/drawingml/2006/picture">
-            <wp:extent cx="3291840" cy="1188720"/>
-            <wp:docPr id="1" name="Picture 1"/>
-            <wp:cNvGraphicFramePr>
-              <a:graphicFrameLocks noChangeAspect="1"/>
-            </wp:cNvGraphicFramePr>
-            <a:graphic>
-              <a:graphicData uri="http://schemas.openxmlformats.org/drawingml/2006/picture">
-                <pic:pic>
-                  <pic:nvPicPr>
-                    <pic:cNvPr id="0" name="demo-jobs-old.png"/>
-                    <pic:cNvPicPr/>
-                  </pic:nvPicPr>
-                  <pic:blipFill>
-                    <a:blip r:embed="rId9"/>
-                    <a:stretch>
-                      <a:fillRect/>
-                    </a:stretch>
-                  </pic:blipFill>
-                  <pic:spPr>
-                    <a:xfrm>
-                      <a:off x="0" y="0"/>
-                      <a:ext cx="3291840" cy="1188720"/>
-                    </a:xfrm>
-                    <a:prstGeom prst="rect"/>
-                  </pic:spPr>
-                </pic:pic>
-              </a:graphicData>
-            </a:graphic>
-          </wp:inline>
-        </w:drawing>
-      </w:r>
-    </w:p>
-    <w:p>
-      <w:r>
-        <w:rPr>
-          <w:b w:val="0"/>
-          <w:i w:val="0"/>
-          <w:color w:val="009933"/>
-        </w:rPr>
-        <w:t>New screenshot of the updated Jobs tab:</w:t>
-      </w:r>
-      <w:r>
-        <w:drawing>
-          <wp:inline xmlns:a="http://schemas.openxmlformats.org/drawingml/2006/main" xmlns:pic="http://schemas.openxmlformats.org/drawingml/2006/picture">
-            <wp:extent cx="3291840" cy="1188720"/>
-            <wp:docPr id="2" name="Picture 2"/>
-            <wp:cNvGraphicFramePr>
-              <a:graphicFrameLocks noChangeAspect="1"/>
-            </wp:cNvGraphicFramePr>
-            <a:graphic>
-              <a:graphicData uri="http://schemas.openxmlformats.org/drawingml/2006/picture">
-                <pic:pic>
-                  <pic:nvPicPr>
-                    <pic:cNvPr id="0" name="demo-jobs-new.png"/>
-                    <pic:cNvPicPr/>
-                  </pic:nvPicPr>
-                  <pic:blipFill>
-                    <a:blip r:embed="rId10"/>
-                    <a:stretch>
-                      <a:fillRect/>
-                    </a:stretch>
-                  </pic:blipFill>
-                  <pic:spPr>
-                    <a:xfrm>
-                      <a:off x="0" y="0"/>
-                      <a:ext cx="3291840" cy="1188720"/>
-                    </a:xfrm>
-                    <a:prstGeom prst="rect"/>
-                  </pic:spPr>
-                </pic:pic>
-              </a:graphicData>
-            </a:graphic>
-          </wp:inline>
-        </w:drawing>
+        <w:t>Pros can ask past customers for reviews from the Profile tab.</w:t>
       </w:r>
     </w:p>
     <w:p>
@@ -390,7 +935,204 @@
           <w:b w:val="0"/>
           <w:i w:val="0"/>
         </w:rPr>
-        <w:t>3. Lead prices</w:t>
+        <w:t>4. Leads and targeting</w:t>
+      </w:r>
+    </w:p>
+    <w:p>
+      <w:pPr>
+        <w:pStyle w:val="Heading3"/>
+      </w:pPr>
+      <w:r>
+        <w:rPr>
+          <w:b w:val="0"/>
+          <w:i w:val="0"/>
+        </w:rPr>
+        <w:t>a. Lead types</w:t>
+      </w:r>
+    </w:p>
+    <w:p>
+      <w:r>
+        <w:rPr>
+          <w:b w:val="0"/>
+          <w:i w:val="0"/>
+        </w:rPr>
+        <w:t xml:space="preserve">There are three main lead types. See </w:t>
+      </w:r>
+      <w:r>
+        <w:rPr>
+          <w:b/>
+          <w:i w:val="0"/>
+        </w:rPr>
+        <w:t>Key terms</w:t>
+      </w:r>
+      <w:r>
+        <w:rPr>
+          <w:b w:val="0"/>
+          <w:i w:val="0"/>
+        </w:rPr>
+        <w:t xml:space="preserve"> above.</w:t>
+      </w:r>
+    </w:p>
+    <w:p>
+      <w:pPr>
+        <w:pStyle w:val="Heading3"/>
+      </w:pPr>
+      <w:r>
+        <w:rPr>
+          <w:b w:val="0"/>
+          <w:i w:val="0"/>
+        </w:rPr>
+        <w:t>b. Targeting preferences</w:t>
+      </w:r>
+    </w:p>
+    <w:p>
+      <w:pPr>
+        <w:pStyle w:val="ListParagraph"/>
+        <w:numPr>
+          <w:ilvl w:val="0"/>
+          <w:numId w:val="15"/>
+        </w:numPr>
+      </w:pPr>
+      <w:r>
+        <w:rPr>
+          <w:b w:val="0"/>
+          <w:i w:val="0"/>
+        </w:rPr>
+        <w:t>Services</w:t>
+      </w:r>
+    </w:p>
+    <w:p>
+      <w:pPr>
+        <w:pStyle w:val="ListParagraph"/>
+        <w:numPr>
+          <w:ilvl w:val="1"/>
+          <w:numId w:val="15"/>
+        </w:numPr>
+      </w:pPr>
+      <w:r>
+        <w:rPr>
+          <w:b w:val="0"/>
+          <w:i w:val="0"/>
+        </w:rPr>
+        <w:t>Job types they want</w:t>
+      </w:r>
+    </w:p>
+    <w:p>
+      <w:pPr>
+        <w:pStyle w:val="ListParagraph"/>
+        <w:numPr>
+          <w:ilvl w:val="1"/>
+          <w:numId w:val="15"/>
+        </w:numPr>
+      </w:pPr>
+      <w:r>
+        <w:rPr>
+          <w:b w:val="0"/>
+          <w:i w:val="0"/>
+        </w:rPr>
+        <w:t>Job types they don't want</w:t>
+      </w:r>
+    </w:p>
+    <w:p>
+      <w:pPr>
+        <w:pStyle w:val="ListParagraph"/>
+        <w:numPr>
+          <w:ilvl w:val="0"/>
+          <w:numId w:val="15"/>
+        </w:numPr>
+      </w:pPr>
+      <w:r>
+        <w:rPr>
+          <w:b w:val="0"/>
+          <w:i w:val="0"/>
+        </w:rPr>
+        <w:t>Travel area</w:t>
+      </w:r>
+    </w:p>
+    <w:p>
+      <w:pPr>
+        <w:pStyle w:val="ListParagraph"/>
+        <w:numPr>
+          <w:ilvl w:val="1"/>
+          <w:numId w:val="15"/>
+        </w:numPr>
+      </w:pPr>
+      <w:r>
+        <w:rPr>
+          <w:b w:val="0"/>
+          <w:i w:val="0"/>
+        </w:rPr>
+        <w:t>Distance from their address</w:t>
+      </w:r>
+    </w:p>
+    <w:p>
+      <w:pPr>
+        <w:pStyle w:val="ListParagraph"/>
+        <w:numPr>
+          <w:ilvl w:val="1"/>
+          <w:numId w:val="15"/>
+        </w:numPr>
+      </w:pPr>
+      <w:r>
+        <w:rPr>
+          <w:b w:val="0"/>
+          <w:i w:val="0"/>
+          <w:color w:val="009933"/>
+        </w:rPr>
+        <w:t>Specific ZIP codes</w:t>
+      </w:r>
+    </w:p>
+    <w:p>
+      <w:pPr>
+        <w:pStyle w:val="ListParagraph"/>
+        <w:numPr>
+          <w:ilvl w:val="0"/>
+          <w:numId w:val="15"/>
+        </w:numPr>
+      </w:pPr>
+      <w:r>
+        <w:rPr>
+          <w:b w:val="0"/>
+          <w:i w:val="0"/>
+        </w:rPr>
+        <w:t>Availability</w:t>
+      </w:r>
+    </w:p>
+    <w:p>
+      <w:pPr>
+        <w:pStyle w:val="Heading3"/>
+      </w:pPr>
+      <w:r>
+        <w:rPr>
+          <w:b w:val="0"/>
+          <w:i w:val="0"/>
+          <w:strike/>
+          <w:color w:val="FF0000"/>
+        </w:rPr>
+        <w:t>c. Lead quality score</w:t>
+      </w:r>
+    </w:p>
+    <w:p>
+      <w:r>
+        <w:rPr>
+          <w:b w:val="0"/>
+          <w:i w:val="0"/>
+          <w:strike/>
+          <w:color w:val="FF0000"/>
+        </w:rPr>
+        <w:t>Each lead has a hidden quality score.</w:t>
+      </w:r>
+    </w:p>
+    <w:p>
+      <w:pPr>
+        <w:pStyle w:val="Heading2"/>
+      </w:pPr>
+      <w:r>
+        <w:rPr>
+          <w:b w:val="0"/>
+          <w:i w:val="0"/>
+        </w:rPr>
+        <w:t>5. Pricing and budget</w:t>
       </w:r>
     </w:p>
     <w:tbl>
@@ -600,6 +1342,66 @@
       </w:tr>
     </w:tbl>
     <w:p>
+      <w:r>
+        <w:rPr>
+          <w:b w:val="0"/>
+          <w:i w:val="0"/>
+        </w:rPr>
+        <w:t xml:space="preserve">The weekly budget is the most a pro spends on leads in a week. It resets every </w:t>
+      </w:r>
+      <w:r>
+        <w:rPr>
+          <w:b w:val="0"/>
+          <w:i w:val="0"/>
+          <w:strike/>
+          <w:color w:val="FF0000"/>
+        </w:rPr>
+        <w:t>Sunday</w:t>
+      </w:r>
+      <w:r>
+        <w:rPr>
+          <w:b w:val="0"/>
+          <w:i w:val="0"/>
+          <w:color w:val="009933"/>
+        </w:rPr>
+        <w:t>Monday</w:t>
+      </w:r>
+      <w:r>
+        <w:rPr>
+          <w:b w:val="0"/>
+          <w:i w:val="0"/>
+        </w:rPr>
+        <w:t>.</w:t>
+      </w:r>
+    </w:p>
+    <w:p>
+      <w:r>
+        <w:rPr>
+          <w:b/>
+        </w:rPr>
+        <w:t>▶ Example</w:t>
+      </w:r>
+    </w:p>
+    <w:p>
+      <w:r>
+        <w:rPr>
+          <w:b w:val="0"/>
+          <w:i w:val="0"/>
+        </w:rPr>
+        <w:t>A pro with a $100 weekly budget who gets 5 leads at $20 reaches the budget.</w:t>
+      </w:r>
+    </w:p>
+    <w:p>
+      <w:r>
+        <w:rPr>
+          <w:b w:val="0"/>
+          <w:i w:val="0"/>
+          <w:color w:val="009933"/>
+        </w:rPr>
+        <w:t>After that, they stop getting new leads until the budget resets.</w:t>
+      </w:r>
+    </w:p>
+    <w:p>
       <w:pPr>
         <w:pStyle w:val="Heading2"/>
       </w:pPr>
@@ -608,7 +1410,600 @@
           <w:b w:val="0"/>
           <w:i w:val="0"/>
         </w:rPr>
-        <w:t>4. Troubleshooting</w:t>
+        <w:t>6. Messages and quotes</w:t>
+      </w:r>
+    </w:p>
+    <w:p>
+      <w:pPr>
+        <w:pStyle w:val="ListParagraph"/>
+        <w:numPr>
+          <w:ilvl w:val="0"/>
+          <w:numId w:val="16"/>
+        </w:numPr>
+      </w:pPr>
+      <w:r>
+        <w:rPr>
+          <w:b w:val="0"/>
+          <w:i w:val="0"/>
+        </w:rPr>
+        <w:t xml:space="preserve">Open the lead from the </w:t>
+      </w:r>
+      <w:r>
+        <w:rPr>
+          <w:b/>
+          <w:i w:val="0"/>
+        </w:rPr>
+        <w:t>Jobs</w:t>
+      </w:r>
+      <w:r>
+        <w:rPr>
+          <w:b w:val="0"/>
+          <w:i w:val="0"/>
+        </w:rPr>
+        <w:t xml:space="preserve"> tab.</w:t>
+      </w:r>
+    </w:p>
+    <w:p>
+      <w:pPr>
+        <w:pStyle w:val="ListParagraph"/>
+        <w:numPr>
+          <w:ilvl w:val="0"/>
+          <w:numId w:val="16"/>
+        </w:numPr>
+      </w:pPr>
+      <w:r>
+        <w:rPr>
+          <w:b w:val="0"/>
+          <w:i w:val="0"/>
+        </w:rPr>
+        <w:t>Read the project details.</w:t>
+      </w:r>
+    </w:p>
+    <w:p>
+      <w:pPr>
+        <w:pStyle w:val="ListParagraph"/>
+        <w:numPr>
+          <w:ilvl w:val="0"/>
+          <w:numId w:val="16"/>
+        </w:numPr>
+      </w:pPr>
+      <w:r>
+        <w:rPr>
+          <w:b w:val="0"/>
+          <w:i w:val="0"/>
+        </w:rPr>
+        <w:t>Send a quote or a message.</w:t>
+      </w:r>
+    </w:p>
+    <w:p>
+      <w:pPr>
+        <w:pStyle w:val="ListParagraph"/>
+        <w:numPr>
+          <w:ilvl w:val="0"/>
+          <w:numId w:val="16"/>
+        </w:numPr>
+      </w:pPr>
+      <w:r>
+        <w:rPr>
+          <w:b w:val="0"/>
+          <w:i w:val="0"/>
+          <w:color w:val="009933"/>
+        </w:rPr>
+        <w:t>Follow up if the customer doesn't answer in 2 days.</w:t>
+      </w:r>
+    </w:p>
+    <w:p>
+      <w:r>
+        <w:rPr>
+          <w:i/>
+        </w:rPr>
+        <w:t>[Image: demo-jobs-old.png]</w:t>
+      </w:r>
+    </w:p>
+    <w:p>
+      <w:r>
+        <w:rPr>
+          <w:b w:val="0"/>
+          <w:i w:val="0"/>
+          <w:color w:val="009933"/>
+        </w:rPr>
+        <w:t>New screenshot of the updated Jobs tab:</w:t>
+      </w:r>
+      <w:r>
+        <w:drawing>
+          <wp:inline xmlns:a="http://schemas.openxmlformats.org/drawingml/2006/main" xmlns:pic="http://schemas.openxmlformats.org/drawingml/2006/picture">
+            <wp:extent cx="3291840" cy="1188720"/>
+            <wp:docPr id="1" name="Picture 1"/>
+            <wp:cNvGraphicFramePr>
+              <a:graphicFrameLocks noChangeAspect="1"/>
+            </wp:cNvGraphicFramePr>
+            <a:graphic>
+              <a:graphicData uri="http://schemas.openxmlformats.org/drawingml/2006/picture">
+                <pic:pic>
+                  <pic:nvPicPr>
+                    <pic:cNvPr id="0" name="demo-jobs-new.png"/>
+                    <pic:cNvPicPr/>
+                  </pic:nvPicPr>
+                  <pic:blipFill>
+                    <a:blip r:embed="rId10"/>
+                    <a:stretch>
+                      <a:fillRect/>
+                    </a:stretch>
+                  </pic:blipFill>
+                  <pic:spPr>
+                    <a:xfrm>
+                      <a:off x="0" y="0"/>
+                      <a:ext cx="3291840" cy="1188720"/>
+                    </a:xfrm>
+                    <a:prstGeom prst="rect"/>
+                  </pic:spPr>
+                </pic:pic>
+              </a:graphicData>
+            </a:graphic>
+          </wp:inline>
+        </w:drawing>
+      </w:r>
+    </w:p>
+    <w:p>
+      <w:r>
+        <w:rPr>
+          <w:b w:val="0"/>
+          <w:i/>
+        </w:rPr>
+        <w:t>Tip: pros who reply in the first hour get hired more often.</w:t>
+      </w:r>
+    </w:p>
+    <w:p>
+      <w:pPr>
+        <w:pStyle w:val="Heading2"/>
+      </w:pPr>
+      <w:r>
+        <w:rPr>
+          <w:b w:val="0"/>
+          <w:i w:val="0"/>
+        </w:rPr>
+        <w:t>7. Payments and refunds</w:t>
+      </w:r>
+    </w:p>
+    <w:p>
+      <w:pPr>
+        <w:pStyle w:val="ListParagraph"/>
+        <w:numPr>
+          <w:ilvl w:val="0"/>
+          <w:numId w:val="17"/>
+        </w:numPr>
+      </w:pPr>
+      <w:r>
+        <w:rPr>
+          <w:b w:val="0"/>
+          <w:i w:val="0"/>
+        </w:rPr>
+        <w:t>Pros pay for leads with the card on file.</w:t>
+      </w:r>
+    </w:p>
+    <w:p>
+      <w:pPr>
+        <w:pStyle w:val="ListParagraph"/>
+        <w:numPr>
+          <w:ilvl w:val="0"/>
+          <w:numId w:val="17"/>
+        </w:numPr>
+      </w:pPr>
+      <w:r>
+        <w:rPr>
+          <w:b w:val="0"/>
+          <w:i w:val="0"/>
+        </w:rPr>
+        <w:t>Charges show up as Thumbtack on the bank statement.</w:t>
+      </w:r>
+    </w:p>
+    <w:p>
+      <w:pPr>
+        <w:pStyle w:val="ListParagraph"/>
+        <w:numPr>
+          <w:ilvl w:val="0"/>
+          <w:numId w:val="17"/>
+        </w:numPr>
+      </w:pPr>
+      <w:r>
+        <w:rPr>
+          <w:b w:val="0"/>
+          <w:i w:val="0"/>
+        </w:rPr>
+        <w:t xml:space="preserve">Pros can see every charge in </w:t>
+      </w:r>
+      <w:r>
+        <w:rPr>
+          <w:b/>
+          <w:i w:val="0"/>
+        </w:rPr>
+        <w:t>Payment history</w:t>
+      </w:r>
+      <w:r>
+        <w:rPr>
+          <w:b w:val="0"/>
+          <w:i w:val="0"/>
+        </w:rPr>
+        <w:t>.</w:t>
+      </w:r>
+    </w:p>
+    <w:tbl>
+      <w:tblPr>
+        <w:tblStyle w:val="TableGrid"/>
+        <w:tblW w:type="auto" w:w="0"/>
+        <w:tblLook w:firstColumn="1" w:firstRow="1" w:lastColumn="0" w:lastRow="0" w:noHBand="0" w:noVBand="1" w:val="04A0"/>
+      </w:tblPr>
+      <w:tblGrid>
+        <w:gridCol w:w="4320"/>
+        <w:gridCol w:w="4320"/>
+      </w:tblGrid>
+      <w:tr>
+        <w:tc>
+          <w:tcPr>
+            <w:tcW w:type="dxa" w:w="4320"/>
+          </w:tcPr>
+          <w:p>
+            <w:r>
+              <w:rPr>
+                <w:b/>
+                <w:i w:val="0"/>
+              </w:rPr>
+              <w:t>Reason</w:t>
+            </w:r>
+          </w:p>
+        </w:tc>
+        <w:tc>
+          <w:tcPr>
+            <w:tcW w:type="dxa" w:w="4320"/>
+          </w:tcPr>
+          <w:p>
+            <w:r>
+              <w:rPr>
+                <w:b/>
+                <w:i w:val="0"/>
+              </w:rPr>
+              <w:t>Credit?</w:t>
+            </w:r>
+          </w:p>
+        </w:tc>
+      </w:tr>
+      <w:tr>
+        <w:tc>
+          <w:tcPr>
+            <w:tcW w:type="dxa" w:w="4320"/>
+          </w:tcPr>
+          <w:p>
+            <w:r>
+              <w:rPr>
+                <w:b w:val="0"/>
+                <w:i w:val="0"/>
+              </w:rPr>
+              <w:t>The customer's contact info is wrong</w:t>
+            </w:r>
+          </w:p>
+        </w:tc>
+        <w:tc>
+          <w:tcPr>
+            <w:tcW w:type="dxa" w:w="4320"/>
+          </w:tcPr>
+          <w:p>
+            <w:r>
+              <w:rPr>
+                <w:b w:val="0"/>
+                <w:i w:val="0"/>
+              </w:rPr>
+              <w:t>Yes</w:t>
+            </w:r>
+          </w:p>
+        </w:tc>
+      </w:tr>
+      <w:tr>
+        <w:tc>
+          <w:tcPr>
+            <w:tcW w:type="dxa" w:w="4320"/>
+          </w:tcPr>
+          <w:p>
+            <w:r>
+              <w:rPr>
+                <w:b w:val="0"/>
+                <w:i w:val="0"/>
+              </w:rPr>
+              <w:t>The job is outside the travel area</w:t>
+            </w:r>
+          </w:p>
+        </w:tc>
+        <w:tc>
+          <w:tcPr>
+            <w:tcW w:type="dxa" w:w="4320"/>
+          </w:tcPr>
+          <w:p>
+            <w:r>
+              <w:rPr>
+                <w:b w:val="0"/>
+                <w:i w:val="0"/>
+              </w:rPr>
+              <w:t>Yes</w:t>
+            </w:r>
+          </w:p>
+        </w:tc>
+      </w:tr>
+      <w:tr>
+        <w:tc>
+          <w:tcPr>
+            <w:tcW w:type="dxa" w:w="4320"/>
+          </w:tcPr>
+          <w:p>
+            <w:r>
+              <w:rPr>
+                <w:b w:val="0"/>
+                <w:i w:val="0"/>
+              </w:rPr>
+              <w:t>The pro changed their mind</w:t>
+            </w:r>
+          </w:p>
+        </w:tc>
+        <w:tc>
+          <w:tcPr>
+            <w:tcW w:type="dxa" w:w="4320"/>
+          </w:tcPr>
+          <w:p>
+            <w:r>
+              <w:rPr>
+                <w:b w:val="0"/>
+                <w:i w:val="0"/>
+              </w:rPr>
+              <w:t>No</w:t>
+            </w:r>
+          </w:p>
+        </w:tc>
+      </w:tr>
+      <w:tr>
+        <w:tc>
+          <w:tcPr>
+            <w:tcW w:type="dxa" w:w="4320"/>
+          </w:tcPr>
+          <w:p>
+            <w:r>
+              <w:rPr>
+                <w:b w:val="0"/>
+                <w:i w:val="0"/>
+                <w:color w:val="009933"/>
+              </w:rPr>
+              <w:t>Duplicate lead from the same customer</w:t>
+            </w:r>
+          </w:p>
+        </w:tc>
+        <w:tc>
+          <w:tcPr>
+            <w:tcW w:type="dxa" w:w="4320"/>
+          </w:tcPr>
+          <w:p>
+            <w:r>
+              <w:rPr>
+                <w:b w:val="0"/>
+                <w:i w:val="0"/>
+                <w:color w:val="009933"/>
+              </w:rPr>
+              <w:t>Yes</w:t>
+            </w:r>
+          </w:p>
+        </w:tc>
+      </w:tr>
+    </w:tbl>
+    <w:p>
+      <w:r>
+        <w:rPr>
+          <w:b w:val="0"/>
+          <w:i w:val="0"/>
+        </w:rPr>
+        <w:t xml:space="preserve">Credit requests are reviewed in </w:t>
+      </w:r>
+      <w:r>
+        <w:rPr>
+          <w:b w:val="0"/>
+          <w:i w:val="0"/>
+          <w:strike/>
+          <w:color w:val="FF0000"/>
+        </w:rPr>
+        <w:t>5 to 7</w:t>
+      </w:r>
+      <w:r>
+        <w:rPr>
+          <w:b w:val="0"/>
+          <w:i w:val="0"/>
+          <w:color w:val="009933"/>
+        </w:rPr>
+        <w:t>3 to 5</w:t>
+      </w:r>
+      <w:r>
+        <w:rPr>
+          <w:b w:val="0"/>
+          <w:i w:val="0"/>
+        </w:rPr>
+        <w:t xml:space="preserve"> business days.</w:t>
+      </w:r>
+    </w:p>
+    <w:p>
+      <w:pPr>
+        <w:pStyle w:val="Heading2"/>
+      </w:pPr>
+      <w:r>
+        <w:rPr>
+          <w:b w:val="0"/>
+          <w:i w:val="0"/>
+        </w:rPr>
+        <w:t>8. Top Pro and badges</w:t>
+      </w:r>
+    </w:p>
+    <w:p>
+      <w:r>
+        <w:rPr>
+          <w:b w:val="0"/>
+          <w:i w:val="0"/>
+        </w:rPr>
+        <w:t>Top Pro is a badge for pros with great reviews and fast replies. It is checked every quarter.</w:t>
+      </w:r>
+    </w:p>
+    <w:p>
+      <w:pPr>
+        <w:pStyle w:val="ListParagraph"/>
+        <w:numPr>
+          <w:ilvl w:val="0"/>
+          <w:numId w:val="18"/>
+        </w:numPr>
+      </w:pPr>
+      <w:r>
+        <w:rPr>
+          <w:b w:val="0"/>
+          <w:i w:val="0"/>
+        </w:rPr>
+        <w:t>At least 4.8 stars</w:t>
+      </w:r>
+    </w:p>
+    <w:p>
+      <w:pPr>
+        <w:pStyle w:val="ListParagraph"/>
+        <w:numPr>
+          <w:ilvl w:val="0"/>
+          <w:numId w:val="18"/>
+        </w:numPr>
+      </w:pPr>
+      <w:r>
+        <w:rPr>
+          <w:b w:val="0"/>
+          <w:i w:val="0"/>
+        </w:rPr>
+        <w:t>At least 10 reviews</w:t>
+      </w:r>
+    </w:p>
+    <w:p>
+      <w:pPr>
+        <w:pStyle w:val="ListParagraph"/>
+        <w:numPr>
+          <w:ilvl w:val="0"/>
+          <w:numId w:val="18"/>
+        </w:numPr>
+      </w:pPr>
+      <w:r>
+        <w:rPr>
+          <w:b w:val="0"/>
+          <w:i w:val="0"/>
+        </w:rPr>
+        <w:t>Replies to most leads</w:t>
+      </w:r>
+    </w:p>
+    <w:p>
+      <w:pPr>
+        <w:pStyle w:val="ListParagraph"/>
+        <w:numPr>
+          <w:ilvl w:val="0"/>
+          <w:numId w:val="18"/>
+        </w:numPr>
+      </w:pPr>
+      <w:r>
+        <w:rPr>
+          <w:b w:val="0"/>
+          <w:i w:val="0"/>
+          <w:strike/>
+          <w:color w:val="FF0000"/>
+        </w:rPr>
+        <w:t>Has a website</w:t>
+      </w:r>
+    </w:p>
+    <w:p>
+      <w:pPr>
+        <w:pStyle w:val="Heading2"/>
+      </w:pPr>
+      <w:r>
+        <w:rPr>
+          <w:b w:val="0"/>
+          <w:i w:val="0"/>
+        </w:rPr>
+        <w:t>9. Account safety</w:t>
+      </w:r>
+    </w:p>
+    <w:p>
+      <w:pPr>
+        <w:pStyle w:val="ListParagraph"/>
+        <w:numPr>
+          <w:ilvl w:val="0"/>
+          <w:numId w:val="19"/>
+        </w:numPr>
+      </w:pPr>
+      <w:r>
+        <w:rPr>
+          <w:b w:val="0"/>
+          <w:i w:val="0"/>
+        </w:rPr>
+        <w:t>Never share the verification code.</w:t>
+      </w:r>
+    </w:p>
+    <w:p>
+      <w:pPr>
+        <w:pStyle w:val="ListParagraph"/>
+        <w:numPr>
+          <w:ilvl w:val="0"/>
+          <w:numId w:val="19"/>
+        </w:numPr>
+      </w:pPr>
+      <w:r>
+        <w:rPr>
+          <w:b w:val="0"/>
+          <w:i w:val="0"/>
+        </w:rPr>
+        <w:t>Thumbtack will never ask for a password by phone.</w:t>
+      </w:r>
+    </w:p>
+    <w:p>
+      <w:pPr>
+        <w:pStyle w:val="ListParagraph"/>
+        <w:numPr>
+          <w:ilvl w:val="0"/>
+          <w:numId w:val="19"/>
+        </w:numPr>
+      </w:pPr>
+      <w:r>
+        <w:rPr>
+          <w:b w:val="0"/>
+          <w:i w:val="0"/>
+          <w:color w:val="009933"/>
+        </w:rPr>
+        <w:t>Turn on two-step verification in Settings.</w:t>
+      </w:r>
+    </w:p>
+    <w:p>
+      <w:r>
+        <w:rPr>
+          <w:b w:val="0"/>
+          <w:i w:val="0"/>
+        </w:rPr>
+        <w:t xml:space="preserve">If a pro thinks their account was hacked, </w:t>
+      </w:r>
+      <w:r>
+        <w:rPr>
+          <w:b/>
+          <w:i w:val="0"/>
+        </w:rPr>
+        <w:t>escalate to Trust &amp; Safety</w:t>
+      </w:r>
+      <w:r>
+        <w:rPr>
+          <w:b w:val="0"/>
+          <w:i w:val="0"/>
+        </w:rPr>
+        <w:t xml:space="preserve"> right away.</w:t>
+      </w:r>
+    </w:p>
+    <w:p>
+      <w:pPr>
+        <w:pStyle w:val="Heading2"/>
+      </w:pPr>
+      <w:r>
+        <w:rPr>
+          <w:b w:val="0"/>
+          <w:i w:val="0"/>
+        </w:rPr>
+        <w:t>10. Troubleshooting</w:t>
       </w:r>
     </w:p>
     <w:p>
@@ -625,7 +2020,7 @@
           <w:b w:val="0"/>
           <w:i w:val="0"/>
         </w:rPr>
-        <w:t>Check that their targeting is on and their budget isn't used up.</w:t>
+        <w:t>Check that targeting is on and the budget isn't used up.</w:t>
       </w:r>
       <w:r>
         <w:rPr>
@@ -654,6 +2049,63 @@
       </w:r>
     </w:p>
     <w:p>
+      <w:r>
+        <w:rPr>
+          <w:b/>
+        </w:rPr>
+        <w:t>▶ The pro can't log in</w:t>
+      </w:r>
+    </w:p>
+    <w:p>
+      <w:pPr>
+        <w:pStyle w:val="ListParagraph"/>
+        <w:numPr>
+          <w:ilvl w:val="0"/>
+          <w:numId w:val="20"/>
+        </w:numPr>
+      </w:pPr>
+      <w:r>
+        <w:rPr>
+          <w:b w:val="0"/>
+          <w:i w:val="0"/>
+        </w:rPr>
+        <w:t>Check the email on the account.</w:t>
+      </w:r>
+    </w:p>
+    <w:p>
+      <w:pPr>
+        <w:pStyle w:val="ListParagraph"/>
+        <w:numPr>
+          <w:ilvl w:val="0"/>
+          <w:numId w:val="20"/>
+        </w:numPr>
+      </w:pPr>
+      <w:r>
+        <w:rPr>
+          <w:b w:val="0"/>
+          <w:i w:val="0"/>
+        </w:rPr>
+        <w:t>Send a password reset link.</w:t>
+      </w:r>
+    </w:p>
+    <w:p>
+      <w:pPr>
+        <w:pStyle w:val="ListParagraph"/>
+        <w:numPr>
+          <w:ilvl w:val="0"/>
+          <w:numId w:val="20"/>
+        </w:numPr>
+      </w:pPr>
+      <w:r>
+        <w:rPr>
+          <w:b w:val="0"/>
+          <w:i w:val="0"/>
+          <w:color w:val="009933"/>
+        </w:rPr>
+        <w:t>If it still fails, ask them to clear the app cache.</w:t>
+      </w:r>
+    </w:p>
+    <w:p>
       <w:pPr>
         <w:pStyle w:val="Heading2"/>
       </w:pPr>
@@ -662,7 +2114,7 @@
           <w:b w:val="0"/>
           <w:i w:val="0"/>
         </w:rPr>
-        <w:t>5. Try it</w:t>
+        <w:t>11. Try it</w:t>
       </w:r>
     </w:p>
     <w:p>
@@ -675,6 +2127,14 @@
       </w:r>
     </w:p>
     <w:p>
+      <w:r>
+        <w:rPr>
+          <w:i/>
+        </w:rPr>
+        <w:t>[Embedded content]</w:t>
+      </w:r>
+    </w:p>
+    <w:p>
       <w:pPr>
         <w:pStyle w:val="Heading2"/>
       </w:pPr>
@@ -682,13 +2142,108 @@
         <w:rPr>
           <w:b w:val="0"/>
           <w:i w:val="0"/>
+          <w:color w:val="009933"/>
         </w:rPr>
-        <w:t>6. Resources</w:t>
+        <w:t>12. Pausing the account</w:t>
+      </w:r>
+    </w:p>
+    <w:p>
+      <w:r>
+        <w:rPr>
+          <w:b w:val="0"/>
+          <w:i w:val="0"/>
+          <w:color w:val="009933"/>
+        </w:rPr>
+        <w:t>Pros can pause their account when they are busy or on vacation. Leads stop until they turn it back on.</w:t>
       </w:r>
     </w:p>
     <w:p>
       <w:pPr>
-        <w:pStyle w:val="ListBullet"/>
+        <w:pStyle w:val="ListParagraph"/>
+        <w:numPr>
+          <w:ilvl w:val="0"/>
+          <w:numId w:val="21"/>
+        </w:numPr>
+      </w:pPr>
+      <w:r>
+        <w:rPr>
+          <w:b w:val="0"/>
+          <w:i w:val="0"/>
+          <w:color w:val="009933"/>
+        </w:rPr>
+        <w:t>Go to Settings.</w:t>
+      </w:r>
+    </w:p>
+    <w:p>
+      <w:pPr>
+        <w:pStyle w:val="ListParagraph"/>
+        <w:numPr>
+          <w:ilvl w:val="0"/>
+          <w:numId w:val="21"/>
+        </w:numPr>
+      </w:pPr>
+      <w:r>
+        <w:rPr>
+          <w:b w:val="0"/>
+          <w:i w:val="0"/>
+          <w:color w:val="009933"/>
+        </w:rPr>
+        <w:t>Tap Pause account.</w:t>
+      </w:r>
+    </w:p>
+    <w:p>
+      <w:pPr>
+        <w:pStyle w:val="ListParagraph"/>
+        <w:numPr>
+          <w:ilvl w:val="0"/>
+          <w:numId w:val="21"/>
+        </w:numPr>
+      </w:pPr>
+      <w:r>
+        <w:rPr>
+          <w:b w:val="0"/>
+          <w:i w:val="0"/>
+          <w:color w:val="009933"/>
+        </w:rPr>
+        <w:t>Pick an end date (optional).</w:t>
+      </w:r>
+    </w:p>
+    <w:p>
+      <w:pPr>
+        <w:pStyle w:val="Heading2"/>
+      </w:pPr>
+      <w:r>
+        <w:rPr>
+          <w:b w:val="0"/>
+          <w:i w:val="0"/>
+          <w:strike/>
+          <w:color w:val="FF0000"/>
+        </w:rPr>
+        <w:t>12</w:t>
+      </w:r>
+      <w:r>
+        <w:rPr>
+          <w:b w:val="0"/>
+          <w:i w:val="0"/>
+          <w:color w:val="009933"/>
+        </w:rPr>
+        <w:t>13</w:t>
+      </w:r>
+      <w:r>
+        <w:rPr>
+          <w:b w:val="0"/>
+          <w:i w:val="0"/>
+        </w:rPr>
+        <w:t>. Resources</w:t>
+      </w:r>
+    </w:p>
+    <w:p>
+      <w:pPr>
+        <w:pStyle w:val="ListParagraph"/>
+        <w:numPr>
+          <w:ilvl w:val="0"/>
+          <w:numId w:val="22"/>
+        </w:numPr>
       </w:pPr>
       <w:hyperlink r:id="rId11">
         <w:r>
@@ -701,7 +2256,37 @@
     </w:p>
     <w:p>
       <w:pPr>
-        <w:pStyle w:val="ListBullet"/>
+        <w:pStyle w:val="ListParagraph"/>
+        <w:numPr>
+          <w:ilvl w:val="0"/>
+          <w:numId w:val="22"/>
+        </w:numPr>
+      </w:pPr>
+      <w:hyperlink r:id="rId11">
+        <w:r>
+          <w:rPr>
+            <w:u w:val="single"/>
+          </w:rPr>
+          <w:t xml:space="preserve">Help Center: Payments</w:t>
+        </w:r>
+      </w:hyperlink>
+      <w:hyperlink r:id="rId11">
+        <w:r>
+          <w:rPr>
+            <w:color w:val="009933"/>
+            <w:u w:val="single"/>
+          </w:rPr>
+          <w:t xml:space="preserve"> and refunds</w:t>
+        </w:r>
+      </w:hyperlink>
+    </w:p>
+    <w:p>
+      <w:pPr>
+        <w:pStyle w:val="ListParagraph"/>
+        <w:numPr>
+          <w:ilvl w:val="0"/>
+          <w:numId w:val="22"/>
+        </w:numPr>
       </w:pPr>
       <w:hyperlink r:id="rId12">
         <w:r>
@@ -714,7 +2299,11 @@
     </w:p>
     <w:p>
       <w:pPr>
-        <w:pStyle w:val="ListBullet"/>
+        <w:pStyle w:val="ListParagraph"/>
+        <w:numPr>
+          <w:ilvl w:val="0"/>
+          <w:numId w:val="22"/>
+        </w:numPr>
       </w:pPr>
       <w:hyperlink r:id="rId13">
         <w:r>
@@ -726,7 +2315,381 @@
         </w:r>
       </w:hyperlink>
     </w:p>
+    <w:p>
+      <w:pPr>
+        <w:pStyle w:val="Heading3"/>
+      </w:pPr>
+      <w:r>
+        <w:rPr>
+          <w:b w:val="0"/>
+          <w:i w:val="0"/>
+        </w:rPr>
+        <w:t>Related articles</w:t>
+      </w:r>
+    </w:p>
+    <w:p>
+      <w:pPr>
+        <w:pStyle w:val="ListParagraph"/>
+        <w:numPr>
+          <w:ilvl w:val="0"/>
+          <w:numId w:val="23"/>
+        </w:numPr>
+      </w:pPr>
+      <w:hyperlink r:id="rId14">
+        <w:r>
+          <w:rPr>
+            <w:u w:val="single"/>
+          </w:rPr>
+          <w:t xml:space="preserve">KA: Lead credits (Pro)</w:t>
+        </w:r>
+      </w:hyperlink>
+    </w:p>
+    <w:p>
+      <w:pPr>
+        <w:pStyle w:val="ListParagraph"/>
+        <w:numPr>
+          <w:ilvl w:val="0"/>
+          <w:numId w:val="23"/>
+        </w:numPr>
+      </w:pPr>
+      <w:hyperlink r:id="rId15">
+        <w:r>
+          <w:rPr>
+            <w:color w:val="FF0000"/>
+            <w:strike/>
+            <w:u w:val="single"/>
+          </w:rPr>
+          <w:t xml:space="preserve">KA: Spotlight placement (Pro)</w:t>
+        </w:r>
+      </w:hyperlink>
+    </w:p>
+    <w:p>
+      <w:pPr>
+        <w:pStyle w:val="ListParagraph"/>
+        <w:numPr>
+          <w:ilvl w:val="0"/>
+          <w:numId w:val="23"/>
+        </w:numPr>
+      </w:pPr>
+      <w:hyperlink r:id="rId16">
+        <w:r>
+          <w:rPr>
+            <w:u w:val="single"/>
+          </w:rPr>
+          <w:t xml:space="preserve">KA: Top Pro program (Pro)</w:t>
+        </w:r>
+      </w:hyperlink>
+    </w:p>
+    <w:p>
+      <w:pPr>
+        <w:pStyle w:val="ListParagraph"/>
+        <w:numPr>
+          <w:ilvl w:val="0"/>
+          <w:numId w:val="23"/>
+        </w:numPr>
+      </w:pPr>
+      <w:hyperlink r:id="rId17">
+        <w:r>
+          <w:rPr>
+            <w:color w:val="009933"/>
+            <w:u w:val="single"/>
+          </w:rPr>
+          <w:t xml:space="preserve">KA: Pausing the account (Pro)</w:t>
+        </w:r>
+      </w:hyperlink>
+    </w:p>
+    <w:p>
+      <w:pPr>
+        <w:pStyle w:val="Heading3"/>
+      </w:pPr>
+      <w:r>
+        <w:rPr>
+          <w:b w:val="0"/>
+          <w:i w:val="0"/>
+        </w:rPr>
+        <w:t>Internal notes for reps</w:t>
+      </w:r>
+    </w:p>
+    <w:p>
+      <w:r>
+        <w:rPr>
+          <w:b w:val="0"/>
+          <w:i w:val="0"/>
+        </w:rPr>
+        <w:t>Use these notes when a pro calls or chats in.</w:t>
+      </w:r>
+    </w:p>
+    <w:tbl>
+      <w:tblPr>
+        <w:tblStyle w:val="TableGrid"/>
+        <w:tblW w:type="auto" w:w="0"/>
+        <w:tblLook w:firstColumn="1" w:firstRow="1" w:lastColumn="0" w:lastRow="0" w:noHBand="0" w:noVBand="1" w:val="04A0"/>
+      </w:tblPr>
+      <w:tblGrid>
+        <w:gridCol w:w="2880"/>
+        <w:gridCol w:w="2880"/>
+        <w:gridCol w:w="2880"/>
+      </w:tblGrid>
+      <w:tr>
+        <w:tc>
+          <w:tcPr>
+            <w:tcW w:type="dxa" w:w="2880"/>
+          </w:tcPr>
+          <w:p>
+            <w:r>
+              <w:rPr>
+                <w:b/>
+                <w:i w:val="0"/>
+              </w:rPr>
+              <w:t>Issue</w:t>
+            </w:r>
+          </w:p>
+        </w:tc>
+        <w:tc>
+          <w:tcPr>
+            <w:tcW w:type="dxa" w:w="2880"/>
+          </w:tcPr>
+          <w:p>
+            <w:r>
+              <w:rPr>
+                <w:b/>
+                <w:i w:val="0"/>
+              </w:rPr>
+              <w:t>Team</w:t>
+            </w:r>
+          </w:p>
+        </w:tc>
+        <w:tc>
+          <w:tcPr>
+            <w:tcW w:type="dxa" w:w="2880"/>
+          </w:tcPr>
+          <w:p>
+            <w:r>
+              <w:rPr>
+                <w:b/>
+                <w:i w:val="0"/>
+              </w:rPr>
+              <w:t>How fast</w:t>
+            </w:r>
+          </w:p>
+        </w:tc>
+      </w:tr>
+      <w:tr>
+        <w:tc>
+          <w:tcPr>
+            <w:tcW w:type="dxa" w:w="2880"/>
+          </w:tcPr>
+          <w:p>
+            <w:r>
+              <w:rPr>
+                <w:b w:val="0"/>
+                <w:i w:val="0"/>
+              </w:rPr>
+              <w:t>Account hacked</w:t>
+            </w:r>
+          </w:p>
+        </w:tc>
+        <w:tc>
+          <w:tcPr>
+            <w:tcW w:type="dxa" w:w="2880"/>
+          </w:tcPr>
+          <w:p>
+            <w:r>
+              <w:rPr>
+                <w:b w:val="0"/>
+                <w:i w:val="0"/>
+              </w:rPr>
+              <w:t>Trust &amp; Safety</w:t>
+            </w:r>
+          </w:p>
+        </w:tc>
+        <w:tc>
+          <w:tcPr>
+            <w:tcW w:type="dxa" w:w="2880"/>
+          </w:tcPr>
+          <w:p>
+            <w:r>
+              <w:rPr>
+                <w:b w:val="0"/>
+                <w:i w:val="0"/>
+              </w:rPr>
+              <w:t>Right away</w:t>
+            </w:r>
+          </w:p>
+        </w:tc>
+      </w:tr>
+      <w:tr>
+        <w:tc>
+          <w:tcPr>
+            <w:tcW w:type="dxa" w:w="2880"/>
+          </w:tcPr>
+          <w:p>
+            <w:r>
+              <w:rPr>
+                <w:b w:val="0"/>
+                <w:i w:val="0"/>
+              </w:rPr>
+              <w:t>Charged twice</w:t>
+            </w:r>
+          </w:p>
+        </w:tc>
+        <w:tc>
+          <w:tcPr>
+            <w:tcW w:type="dxa" w:w="2880"/>
+          </w:tcPr>
+          <w:p>
+            <w:r>
+              <w:rPr>
+                <w:b w:val="0"/>
+                <w:i w:val="0"/>
+              </w:rPr>
+              <w:t>Billing</w:t>
+            </w:r>
+          </w:p>
+        </w:tc>
+        <w:tc>
+          <w:tcPr>
+            <w:tcW w:type="dxa" w:w="2880"/>
+          </w:tcPr>
+          <w:p>
+            <w:r>
+              <w:rPr>
+                <w:b w:val="0"/>
+                <w:i w:val="0"/>
+              </w:rPr>
+              <w:t>Same day</w:t>
+            </w:r>
+          </w:p>
+        </w:tc>
+      </w:tr>
+      <w:tr>
+        <w:tc>
+          <w:tcPr>
+            <w:tcW w:type="dxa" w:w="2880"/>
+          </w:tcPr>
+          <w:p>
+            <w:r>
+              <w:rPr>
+                <w:b w:val="0"/>
+                <w:i w:val="0"/>
+              </w:rPr>
+              <w:t>App bug</w:t>
+            </w:r>
+          </w:p>
+        </w:tc>
+        <w:tc>
+          <w:tcPr>
+            <w:tcW w:type="dxa" w:w="2880"/>
+          </w:tcPr>
+          <w:p>
+            <w:r>
+              <w:rPr>
+                <w:b w:val="0"/>
+                <w:i w:val="0"/>
+              </w:rPr>
+              <w:t>Product support</w:t>
+            </w:r>
+          </w:p>
+        </w:tc>
+        <w:tc>
+          <w:tcPr>
+            <w:tcW w:type="dxa" w:w="2880"/>
+          </w:tcPr>
+          <w:p>
+            <w:r>
+              <w:rPr>
+                <w:b w:val="0"/>
+                <w:i w:val="0"/>
+                <w:strike/>
+                <w:color w:val="FF0000"/>
+              </w:rPr>
+              <w:t>3</w:t>
+            </w:r>
+            <w:r>
+              <w:rPr>
+                <w:b w:val="0"/>
+                <w:i w:val="0"/>
+                <w:color w:val="009933"/>
+              </w:rPr>
+              <w:t>2</w:t>
+            </w:r>
+            <w:r>
+              <w:rPr>
+                <w:b w:val="0"/>
+                <w:i w:val="0"/>
+              </w:rPr>
+              <w:t xml:space="preserve"> business days</w:t>
+            </w:r>
+          </w:p>
+        </w:tc>
+      </w:tr>
+      <w:tr>
+        <w:tc>
+          <w:tcPr>
+            <w:tcW w:type="dxa" w:w="2880"/>
+          </w:tcPr>
+          <w:p>
+            <w:r>
+              <w:rPr>
+                <w:b w:val="0"/>
+                <w:i w:val="0"/>
+                <w:color w:val="009933"/>
+              </w:rPr>
+              <w:t>Lead fraud</w:t>
+            </w:r>
+          </w:p>
+        </w:tc>
+        <w:tc>
+          <w:tcPr>
+            <w:tcW w:type="dxa" w:w="2880"/>
+          </w:tcPr>
+          <w:p>
+            <w:r>
+              <w:rPr>
+                <w:b w:val="0"/>
+                <w:i w:val="0"/>
+                <w:color w:val="009933"/>
+              </w:rPr>
+              <w:t>Trust &amp; Safety</w:t>
+            </w:r>
+          </w:p>
+        </w:tc>
+        <w:tc>
+          <w:tcPr>
+            <w:tcW w:type="dxa" w:w="2880"/>
+          </w:tcPr>
+          <w:p>
+            <w:r>
+              <w:rPr>
+                <w:b w:val="0"/>
+                <w:i w:val="0"/>
+                <w:color w:val="009933"/>
+              </w:rPr>
+              <w:t>Same day</w:t>
+            </w:r>
+          </w:p>
+        </w:tc>
+      </w:tr>
+    </w:tbl>
+    <w:p>
+      <w:r>
+        <w:rPr>
+          <w:b w:val="0"/>
+          <w:i w:val="0"/>
+        </w:rPr>
+        <w:t>Always add a note to the case with what you checked.</w:t>
+      </w:r>
+      <w:r>
+        <w:rPr>
+          <w:b w:val="0"/>
+          <w:i w:val="0"/>
+          <w:color w:val="009933"/>
+        </w:rPr>
+        <w:t xml:space="preserve"> Include screenshots when you can.</w:t>
+      </w:r>
+    </w:p>
     <w:sectPr>
+      <w:headerReference w:type="default" r:id="rId9"/>
       <w:pgSz w:w="12240" w:h="15840"/>
       <w:pgMar w:top="1440" w:right="1800" w:bottom="1440" w:left="1800" w:header="720" w:footer="720" w:gutter="0"/>
       <w:cols w:space="720"/>
@@ -736,8 +2699,84 @@
 </w:document>
 </file>
 
+<file path=word/header1.xml><?xml version="1.0" encoding="utf-8"?>
+<w:hdr xmlns:m="http://schemas.openxmlformats.org/officeDocument/2006/math" xmlns:mc="http://schemas.openxmlformats.org/markup-compatibility/2006" xmlns:mo="http://schemas.microsoft.com/office/mac/office/2008/main" xmlns:mv="urn:schemas-microsoft-com:mac:vml" xmlns:o="urn:schemas-microsoft-com:office:office" xmlns:r="http://schemas.openxmlformats.org/officeDocument/2006/relationships" xmlns:v="urn:schemas-microsoft-com:vml" xmlns:w10="urn:schemas-microsoft-com:office:word" xmlns:w14="http://schemas.microsoft.com/office/word/2010/wordml" xmlns:w="http://schemas.openxmlformats.org/wordprocessingml/2006/main" xmlns:wne="http://schemas.microsoft.com/office/word/2006/wordml" xmlns:wp14="http://schemas.microsoft.com/office/word/2010/wordprocessingDrawing" xmlns:wp="http://schemas.openxmlformats.org/drawingml/2006/wordprocessingDrawing" xmlns:wpc="http://schemas.microsoft.com/office/word/2010/wordprocessingCanvas" xmlns:wpg="http://schemas.microsoft.com/office/word/2010/wordprocessingGroup" xmlns:wpi="http://schemas.microsoft.com/office/word/2010/wordprocessingInk" xmlns:wps="http://schemas.microsoft.com/office/word/2010/wordprocessingShape" mc:Ignorable="w14 wp14">
+  <w:p>
+    <w:pPr>
+      <w:pStyle w:val="Header"/>
+    </w:pPr>
+    <w:r>
+      <w:t>Published link: https://thumbtack.lightning.force.com/articles/Knowledge/Demo-Pro-account-guide</w:t>
+    </w:r>
+  </w:p>
+  <w:p>
+    <w:r>
+      <w:t>KA ID: 000015532</w:t>
+    </w:r>
+  </w:p>
+  <w:p>
+    <w:r>
+      <w:t>Version: 1</w:t>
+    </w:r>
+  </w:p>
+  <w:p>
+    <w:r>
+      <w:t>Last modified in Salesforce: 2026-10-08</w:t>
+    </w:r>
+  </w:p>
+  <w:p>
+    <w:r>
+      <w:t>Current refresh: 2026-10-08 — Demo</w:t>
+    </w:r>
+  </w:p>
+  <w:p>
+    <w:r>
+      <w:t>Previous refresh: N/A</w:t>
+    </w:r>
+  </w:p>
+</w:hdr>
+</file>
+
 <file path=word/numbering.xml><?xml version="1.0" encoding="utf-8"?>
 <w:numbering xmlns:wpc="http://schemas.microsoft.com/office/word/2010/wordprocessingCanvas" xmlns:mo="http://schemas.microsoft.com/office/mac/office/2008/main" xmlns:mc="http://schemas.openxmlformats.org/markup-compatibility/2006" xmlns:mv="urn:schemas-microsoft-com:mac:vml" xmlns:o="urn:schemas-microsoft-com:office:office" xmlns:r="http://schemas.openxmlformats.org/officeDocument/2006/relationships" xmlns:m="http://schemas.openxmlformats.org/officeDocument/2006/math" xmlns:v="urn:schemas-microsoft-com:vml" xmlns:wp14="http://schemas.microsoft.com/office/word/2010/wordprocessingDrawing" xmlns:wp="http://schemas.openxmlformats.org/drawingml/2006/wordprocessingDrawing" xmlns:w10="urn:schemas-microsoft-com:office:word" xmlns:w="http://schemas.openxmlformats.org/wordprocessingml/2006/main" xmlns:w14="http://schemas.microsoft.com/office/word/2010/wordml" xmlns:wpg="http://schemas.microsoft.com/office/word/2010/wordprocessingGroup" xmlns:wpi="http://schemas.microsoft.com/office/word/2010/wordprocessingInk" xmlns:wne="http://schemas.microsoft.com/office/word/2006/wordml" xmlns:wps="http://schemas.microsoft.com/office/word/2010/wordprocessingShape" mc:Ignorable="w14 wp14">
+  <w:abstractNum w:abstractNumId="91">
+    <w:multiLevelType w:val="hybridMultilevel"/>
+    <w:lvl w:ilvl="0">
+      <w:start w:val="1"/>
+      <w:numFmt w:val="bullet"/>
+      <w:lvlText w:val="•"/>
+      <w:pPr>
+        <w:ind w:left="720" w:hanging="360"/>
+      </w:pPr>
+    </w:lvl>
+    <w:lvl w:ilvl="1">
+      <w:start w:val="1"/>
+      <w:numFmt w:val="bullet"/>
+      <w:lvlText w:val="◦"/>
+      <w:pPr>
+        <w:ind w:left="1440" w:hanging="360"/>
+      </w:pPr>
+    </w:lvl>
+  </w:abstractNum>
+  <w:abstractNum w:abstractNumId="90">
+    <w:multiLevelType w:val="hybridMultilevel"/>
+    <w:lvl w:ilvl="0">
+      <w:start w:val="1"/>
+      <w:numFmt w:val="decimal"/>
+      <w:lvlText w:val="%1."/>
+      <w:pPr>
+        <w:ind w:left="720" w:hanging="360"/>
+      </w:pPr>
+    </w:lvl>
+    <w:lvl w:ilvl="1">
+      <w:start w:val="1"/>
+      <w:numFmt w:val="bullet"/>
+      <w:lvlText w:val="◦"/>
+      <w:pPr>
+        <w:ind w:left="1440" w:hanging="360"/>
+      </w:pPr>
+    </w:lvl>
+  </w:abstractNum>
   <w:abstractNum w:abstractNumId="0">
     <w:nsid w:val="FFFFFF7C"/>
     <w:multiLevelType w:val="singleLevel"/>
@@ -935,6 +2974,48 @@
   </w:num>
   <w:num w:numId="9">
     <w:abstractNumId w:val="0"/>
+  </w:num>
+  <w:num w:numId="10">
+    <w:abstractNumId w:val="90"/>
+  </w:num>
+  <w:num w:numId="11">
+    <w:abstractNumId w:val="91"/>
+  </w:num>
+  <w:num w:numId="12">
+    <w:abstractNumId w:val="90"/>
+  </w:num>
+  <w:num w:numId="13">
+    <w:abstractNumId w:val="91"/>
+  </w:num>
+  <w:num w:numId="14">
+    <w:abstractNumId w:val="91"/>
+  </w:num>
+  <w:num w:numId="15">
+    <w:abstractNumId w:val="91"/>
+  </w:num>
+  <w:num w:numId="16">
+    <w:abstractNumId w:val="90"/>
+  </w:num>
+  <w:num w:numId="17">
+    <w:abstractNumId w:val="91"/>
+  </w:num>
+  <w:num w:numId="18">
+    <w:abstractNumId w:val="91"/>
+  </w:num>
+  <w:num w:numId="19">
+    <w:abstractNumId w:val="91"/>
+  </w:num>
+  <w:num w:numId="20">
+    <w:abstractNumId w:val="90"/>
+  </w:num>
+  <w:num w:numId="21">
+    <w:abstractNumId w:val="90"/>
+  </w:num>
+  <w:num w:numId="22">
+    <w:abstractNumId w:val="91"/>
+  </w:num>
+  <w:num w:numId="23">
+    <w:abstractNumId w:val="91"/>
   </w:num>
 </w:numbering>
 </file>

</xml_diff>